<commit_message>
Update full-ring results and presentation checkpoint
</commit_message>
<xml_diff>
--- a/docs/CSX4213_Progress_Report_3D_Rendering_2026-08-31.docx
+++ b/docs/CSX4213_Progress_Report_3D_Rendering_2026-08-31.docx
@@ -15,7 +15,7 @@
         <w:pStyle w:val="papersubtitle"/>
       </w:pPr>
       <w:r>
-        <w:t>Progress Report - Updated 31 August 2026</w:t>
+        <w:t xml:space="preserve">Progress Report </w:t>
       </w:r>
     </w:p>
     <w:p>
@@ -6778,26 +6778,6 @@
 </file>
 
 <file path=customXml/item1.xml><?xml version="1.0" encoding="utf-8"?>
-<?mso-contentType ?>
-<FormTemplates xmlns="http://schemas.microsoft.com/sharepoint/v3/contenttype/forms">
-  <Display>DocumentLibraryForm</Display>
-  <Edit>DocumentLibraryForm</Edit>
-  <New>DocumentLibraryForm</New>
-</FormTemplates>
-</file>
-
-<file path=customXml/item2.xml><?xml version="1.0" encoding="utf-8"?>
-<p:properties xmlns:p="http://schemas.microsoft.com/office/2006/metadata/properties" xmlns:xsi="http://www.w3.org/2001/XMLSchema-instance" xmlns:pc="http://schemas.microsoft.com/office/infopath/2007/PartnerControls">
-  <documentManagement>
-    <TaxCatchAll xmlns="5dbbcfdd-641d-42ed-b89a-2cb2451897ef" xsi:nil="true"/>
-    <lcf76f155ced4ddcb4097134ff3c332f xmlns="c27f7001-81a4-451f-bb72-9c8b6a30fd01">
-      <Terms xmlns="http://schemas.microsoft.com/office/infopath/2007/PartnerControls"/>
-    </lcf76f155ced4ddcb4097134ff3c332f>
-  </documentManagement>
-</p:properties>
-</file>
-
-<file path=customXml/item3.xml><?xml version="1.0" encoding="utf-8"?>
 <ct:contentTypeSchema xmlns:ct="http://schemas.microsoft.com/office/2006/metadata/contentType" xmlns:ma="http://schemas.microsoft.com/office/2006/metadata/properties/metaAttributes" ct:_="" ma:_="" ma:contentTypeName="Document" ma:contentTypeID="0x010100DCA674CEC26FCF4591194308972A7836" ma:contentTypeVersion="10" ma:contentTypeDescription="Create a new document." ma:contentTypeScope="" ma:versionID="1ee74dfc19b53f7f63086a6827ad7ea7">
   <xsd:schema xmlns:xsd="http://www.w3.org/2001/XMLSchema" xmlns:xs="http://www.w3.org/2001/XMLSchema" xmlns:p="http://schemas.microsoft.com/office/2006/metadata/properties" xmlns:ns2="c27f7001-81a4-451f-bb72-9c8b6a30fd01" xmlns:ns3="5dbbcfdd-641d-42ed-b89a-2cb2451897ef" targetNamespace="http://schemas.microsoft.com/office/2006/metadata/properties" ma:root="true" ma:fieldsID="1a063cc532b3c4ab51b029627793b168" ns2:_="" ns3:_="">
     <xsd:import namespace="c27f7001-81a4-451f-bb72-9c8b6a30fd01"/>
@@ -6986,30 +6966,31 @@
 </ct:contentTypeSchema>
 </file>
 
+<file path=customXml/item2.xml><?xml version="1.0" encoding="utf-8"?>
+<p:properties xmlns:p="http://schemas.microsoft.com/office/2006/metadata/properties" xmlns:xsi="http://www.w3.org/2001/XMLSchema-instance" xmlns:pc="http://schemas.microsoft.com/office/infopath/2007/PartnerControls">
+  <documentManagement>
+    <TaxCatchAll xmlns="5dbbcfdd-641d-42ed-b89a-2cb2451897ef" xsi:nil="true"/>
+    <lcf76f155ced4ddcb4097134ff3c332f xmlns="c27f7001-81a4-451f-bb72-9c8b6a30fd01">
+      <Terms xmlns="http://schemas.microsoft.com/office/infopath/2007/PartnerControls"/>
+    </lcf76f155ced4ddcb4097134ff3c332f>
+  </documentManagement>
+</p:properties>
+</file>
+
+<file path=customXml/item3.xml><?xml version="1.0" encoding="utf-8"?>
+<?mso-contentType ?>
+<FormTemplates xmlns="http://schemas.microsoft.com/sharepoint/v3/contenttype/forms">
+  <Display>DocumentLibraryForm</Display>
+  <Edit>DocumentLibraryForm</Edit>
+  <New>DocumentLibraryForm</New>
+</FormTemplates>
+</file>
+
 <file path=customXml/item4.xml><?xml version="1.0" encoding="utf-8"?>
 <b:Sources xmlns:b="http://schemas.openxmlformats.org/officeDocument/2006/bibliography" xmlns="http://schemas.openxmlformats.org/officeDocument/2006/bibliography" SelectedStyle="\APA.XSL" StyleName="APA"/>
 </file>
 
 <file path=customXml/itemProps1.xml><?xml version="1.0" encoding="utf-8"?>
-<ds:datastoreItem xmlns:ds="http://schemas.openxmlformats.org/officeDocument/2006/customXml" ds:itemID="{F2993B60-A8F8-4E3E-AC0F-645CD3999391}">
-  <ds:schemaRefs>
-    <ds:schemaRef ds:uri="http://schemas.microsoft.com/sharepoint/v3/contenttype/forms"/>
-  </ds:schemaRefs>
-</ds:datastoreItem>
-</file>
-
-<file path=customXml/itemProps2.xml><?xml version="1.0" encoding="utf-8"?>
-<ds:datastoreItem xmlns:ds="http://schemas.openxmlformats.org/officeDocument/2006/customXml" ds:itemID="{BD474D59-C140-4160-A654-4DEF6F6446B8}">
-  <ds:schemaRefs>
-    <ds:schemaRef ds:uri="http://schemas.microsoft.com/office/2006/metadata/properties"/>
-    <ds:schemaRef ds:uri="http://schemas.microsoft.com/office/infopath/2007/PartnerControls"/>
-    <ds:schemaRef ds:uri="5dbbcfdd-641d-42ed-b89a-2cb2451897ef"/>
-    <ds:schemaRef ds:uri="c27f7001-81a4-451f-bb72-9c8b6a30fd01"/>
-  </ds:schemaRefs>
-</ds:datastoreItem>
-</file>
-
-<file path=customXml/itemProps3.xml><?xml version="1.0" encoding="utf-8"?>
 <ds:datastoreItem xmlns:ds="http://schemas.openxmlformats.org/officeDocument/2006/customXml" ds:itemID="{D28CC447-685F-4580-93A3-4906AECB669C}">
   <ds:schemaRefs>
     <ds:schemaRef ds:uri="http://schemas.microsoft.com/office/2006/metadata/contentType"/>
@@ -7028,6 +7009,25 @@
 </ds:datastoreItem>
 </file>
 
+<file path=customXml/itemProps2.xml><?xml version="1.0" encoding="utf-8"?>
+<ds:datastoreItem xmlns:ds="http://schemas.openxmlformats.org/officeDocument/2006/customXml" ds:itemID="{BD474D59-C140-4160-A654-4DEF6F6446B8}">
+  <ds:schemaRefs>
+    <ds:schemaRef ds:uri="http://schemas.microsoft.com/office/2006/metadata/properties"/>
+    <ds:schemaRef ds:uri="http://schemas.microsoft.com/office/infopath/2007/PartnerControls"/>
+    <ds:schemaRef ds:uri="5dbbcfdd-641d-42ed-b89a-2cb2451897ef"/>
+    <ds:schemaRef ds:uri="c27f7001-81a4-451f-bb72-9c8b6a30fd01"/>
+  </ds:schemaRefs>
+</ds:datastoreItem>
+</file>
+
+<file path=customXml/itemProps3.xml><?xml version="1.0" encoding="utf-8"?>
+<ds:datastoreItem xmlns:ds="http://schemas.openxmlformats.org/officeDocument/2006/customXml" ds:itemID="{F2993B60-A8F8-4E3E-AC0F-645CD3999391}">
+  <ds:schemaRefs>
+    <ds:schemaRef ds:uri="http://schemas.microsoft.com/sharepoint/v3/contenttype/forms"/>
+  </ds:schemaRefs>
+</ds:datastoreItem>
+</file>
+
 <file path=customXml/itemProps4.xml><?xml version="1.0" encoding="utf-8"?>
 <ds:datastoreItem xmlns:ds="http://schemas.openxmlformats.org/officeDocument/2006/customXml" ds:itemID="{9E966C7F-158E-4883-86A6-4454069232BB}">
   <ds:schemaRefs>

</xml_diff>